<commit_message>
docs: update Word (.docx) examples with 💡 concept reminder box
</commit_message>
<xml_diff>
--- a/examples/一元一次方程式_靜態學習單.docx
+++ b/examples/一元一次方程式_靜態學習單.docx
@@ -107,6 +107,77 @@
                 <w:sz w:val="22"/>
               </w:rPr>
               <w:t>得分：＿＿＿＿</w:t>
+            </w:r>
+          </w:p>
+        </w:tc>
+      </w:tr>
+    </w:tbl>
+    <w:p/>
+    <w:tbl>
+      <w:tblPr>
+        <w:tblW w:type="auto" w:w="0"/>
+        <w:jc w:val="center"/>
+        <w:tblLayout w:type="fixed"/>
+        <w:tblLook w:firstColumn="1" w:firstRow="1" w:lastColumn="0" w:lastRow="0" w:noHBand="0" w:noVBand="1" w:val="04A0"/>
+      </w:tblPr>
+      <w:tblGrid>
+        <w:gridCol w:w="10512"/>
+      </w:tblGrid>
+      <w:tr>
+        <w:tc>
+          <w:tcPr>
+            <w:tcW w:type="dxa" w:w="10512"/>
+            <w:shd w:fill="F8FAFC"/>
+            <w:tcBorders>
+              <w:top w:val="single" w:sz="12" w:space="0" w:color="475569"/>
+              <w:left w:val="single" w:sz="12" w:space="0" w:color="475569"/>
+              <w:bottom w:val="single" w:sz="12" w:space="0" w:color="475569"/>
+              <w:right w:val="single" w:sz="12" w:space="0" w:color="475569"/>
+            </w:tcBorders>
+            <w:tcMar>
+              <w:top w:w="140" w:type="dxa"/>
+              <w:bottom w:w="140" w:type="dxa"/>
+              <w:left w:w="200" w:type="dxa"/>
+              <w:right w:w="200" w:type="dxa"/>
+            </w:tcMar>
+          </w:tcPr>
+          <w:p>
+            <w:pPr>
+              <w:spacing w:after="80"/>
+            </w:pPr>
+            <w:r>
+              <w:rPr>
+                <w:b/>
+                <w:color w:val="1E40AF"/>
+                <w:sz w:val="26"/>
+              </w:rPr>
+              <w:t>💡 觀念提醒：一元一次方程式移項解法</w:t>
+            </w:r>
+          </w:p>
+          <w:p>
+            <w:pPr>
+              <w:spacing w:after="40"/>
+            </w:pPr>
+            <w:r>
+              <w:rPr>
+                <w:b/>
+                <w:color w:val="1F2937"/>
+                <w:sz w:val="23"/>
+              </w:rPr>
+              <w:t>• 移項時，「減號」搬過等號要變成「加號」！</w:t>
+            </w:r>
+          </w:p>
+          <w:p>
+            <w:pPr>
+              <w:spacing w:after="0"/>
+            </w:pPr>
+            <w:r>
+              <w:rPr>
+                <w:b/>
+                <w:color w:val="1F2937"/>
+                <w:sz w:val="23"/>
+              </w:rPr>
+              <w:t>• 數字如果黏在 x 前面，搬過去對面要放到分母喔！</w:t>
             </w:r>
           </w:p>
         </w:tc>

</xml_diff>